<commit_message>
Add Windows smoke runners and package documentation
</commit_message>
<xml_diff>
--- a/docs/Comms_Cloud_Release_Management_Guide_Updated.docx
+++ b/docs/Comms_Cloud_Release_Management_Guide_Updated.docx
@@ -1369,6 +1369,42 @@
     </w:p>
     <w:p>
       <w:pPr>
+        <w:pStyle w:val="Heading2"/>
+      </w:pPr>
+      <w:r>
+        <w:t>Statement convenience runners</w:t>
+      </w:r>
+    </w:p>
+    <w:p>
+      <w:pPr>
+        <w:pStyle w:val="ListBullet"/>
+      </w:pPr>
+      <w:r>
+        <w:rPr>
+          <w:b/>
+        </w:rPr>
+        <w:t xml:space="preserve">Single-environment statement smoke test: </w:t>
+      </w:r>
+      <w:r>
+        <w:t>./run-smoke-stmt.zsh on macOS or run-smoke-stmt.bat on Windows. Defaults to source-tenancy; set OCCS_SMOKE_TARGET to override it.</w:t>
+      </w:r>
+    </w:p>
+    <w:p>
+      <w:pPr>
+        <w:pStyle w:val="ListBullet"/>
+      </w:pPr>
+      <w:r>
+        <w:rPr>
+          <w:b/>
+        </w:rPr>
+        <w:t xml:space="preserve">Statement comparison: </w:t>
+      </w:r>
+      <w:r>
+        <w:t>./run-smoke-compare-stmt.zsh on macOS or run-smoke-compare-stmt.bat on Windows. Defaults to source-tenancy versus target-tenancy; set OCCS_COMPARE_SOURCE and OCCS_COMPARE_TARGET to override them.</w:t>
+      </w:r>
+    </w:p>
+    <w:p>
+      <w:pPr>
         <w:pStyle w:val="Heading1"/>
       </w:pPr>
       <w:r>
@@ -1415,7 +1451,7 @@
           <w:rFonts w:ascii="Calibri" w:hAnsi="Calibri"/>
           <w:sz w:val="22"/>
         </w:rPr>
-        <w:t>The report shows a thumbnail from each environment, separate generation status, and a comparison result.</w:t>
+        <w:t>The report shows a thumbnail from each environment, the input filename, PDF page count, separate generation status, and a comparison result.</w:t>
       </w:r>
     </w:p>
     <w:tbl>
@@ -2436,7 +2472,7 @@
           <w:rFonts w:ascii="Calibri" w:hAnsi="Calibri"/>
           <w:sz w:val="22"/>
         </w:rPr>
-        <w:t>Open smoke-report.html to review the results. Its heading identifies the tested environment and generation time. For a comparison, it identifies the comparison target environment and includes separate generation and visual-comparison counts. Open smoke-email.eml in Mail or Outlook, add recipients and any release context, then send it manually after review. The draft subject follows this pattern:</w:t>
+        <w:t>Open smoke-report.html to review the results. Its heading identifies the tested environment and generation time. Each result identifies the input file and lists the page count for generated PDFs.</w:t>
       </w:r>
     </w:p>
     <w:p>
@@ -4656,7 +4692,7 @@
       <w:r>
         <w:rPr>
           <w:rFonts w:ascii="Calibri" w:hAnsi="Calibri"/>
-          <w:sz w:val="16"/>
+          <w:sz w:val="14"/>
         </w:rPr>
         <w:t>This guide applies the following Oracle Financial Services Cloud configuration-lifecycle and movement material to the OCCS CLI smoke-test workflow:</w:t>
       </w:r>
@@ -4669,7 +4705,7 @@
         <w:rPr>
           <w:rFonts w:ascii="Calibri" w:hAnsi="Calibri"/>
           <w:color w:val="2E74B5"/>
-          <w:sz w:val="16"/>
+          <w:sz w:val="14"/>
           <w:u w:val="single"/>
         </w:rPr>
         <w:t>Understanding Configuration Lifecycle</w:t>
@@ -4678,7 +4714,7 @@
         <w:rPr>
           <w:rFonts w:ascii="Calibri" w:hAnsi="Calibri"/>
           <w:color w:val="5B6573"/>
-          <w:sz w:val="16"/>
+          <w:sz w:val="14"/>
         </w:rPr>
         <w:t xml:space="preserve"> (https://docs.oracle.com/en/industries/financial-services/financial-services-cloud/describesday1configurations/understanding-configuration-lifecycle.html)</w:t>
       </w:r>
@@ -4691,7 +4727,7 @@
         <w:rPr>
           <w:rFonts w:ascii="Calibri" w:hAnsi="Calibri"/>
           <w:color w:val="2E74B5"/>
-          <w:sz w:val="16"/>
+          <w:sz w:val="14"/>
           <w:u w:val="single"/>
         </w:rPr>
         <w:t>Understanding Configuration Movement</w:t>
@@ -4700,7 +4736,7 @@
         <w:rPr>
           <w:rFonts w:ascii="Calibri" w:hAnsi="Calibri"/>
           <w:color w:val="5B6573"/>
-          <w:sz w:val="16"/>
+          <w:sz w:val="14"/>
         </w:rPr>
         <w:t xml:space="preserve"> (https://docs.oracle.com/en/industries/financial-services/financial-services-cloud/describesday1configurations/day1-understanding-configuration-movement.html)</w:t>
       </w:r>
@@ -4713,7 +4749,7 @@
         <w:rPr>
           <w:rFonts w:ascii="Calibri" w:hAnsi="Calibri"/>
           <w:color w:val="2E74B5"/>
-          <w:sz w:val="16"/>
+          <w:sz w:val="14"/>
           <w:u w:val="single"/>
         </w:rPr>
         <w:t>Oracle topic reference: PLAFS-GUID-47C4E7D2-2EC1-4B44-B9A7-2300936956D5</w:t>
@@ -4722,7 +4758,7 @@
         <w:rPr>
           <w:rFonts w:ascii="Calibri" w:hAnsi="Calibri"/>
           <w:color w:val="5B6573"/>
-          <w:sz w:val="16"/>
+          <w:sz w:val="14"/>
         </w:rPr>
         <w:t xml:space="preserve"> (https://docs.oracle.com/pls/topic/lookup?ctx=en/industries/financial-services/financial-services-cloud/describesday1configurations&amp;id=PLAFS-GUID-47C4E7D2-2EC1-4B44-B9A7-2300936956D5)</w:t>
       </w:r>
@@ -4735,7 +4771,7 @@
         <w:rPr>
           <w:rFonts w:ascii="Calibri" w:hAnsi="Calibri"/>
           <w:color w:val="2E74B5"/>
-          <w:sz w:val="16"/>
+          <w:sz w:val="14"/>
           <w:u w:val="single"/>
         </w:rPr>
         <w:t>Oracle topic reference: PLAFS-GUID-DFBBCC90-78E3-4E14-9494-2DBA79C0CCFD</w:t>
@@ -4744,7 +4780,7 @@
         <w:rPr>
           <w:rFonts w:ascii="Calibri" w:hAnsi="Calibri"/>
           <w:color w:val="5B6573"/>
-          <w:sz w:val="16"/>
+          <w:sz w:val="14"/>
         </w:rPr>
         <w:t xml:space="preserve"> (https://docs.oracle.com/pls/topic/lookup?ctx=en/industries/financial-services/financial-services-cloud/describesday1configurations&amp;id=PLAFS-GUID-DFBBCC90-78E3-4E14-9494-2DBA79C0CCFD)</w:t>
       </w:r>
@@ -4757,7 +4793,7 @@
         <w:rPr>
           <w:rFonts w:ascii="Calibri" w:hAnsi="Calibri"/>
           <w:color w:val="2E74B5"/>
-          <w:sz w:val="16"/>
+          <w:sz w:val="14"/>
           <w:u w:val="single"/>
         </w:rPr>
         <w:t>Oracle topic reference: PLAFS-GUID-66E2AEBD-B816-4D4B-9A17-221530ED590F</w:t>
@@ -4766,7 +4802,7 @@
         <w:rPr>
           <w:rFonts w:ascii="Calibri" w:hAnsi="Calibri"/>
           <w:color w:val="5B6573"/>
-          <w:sz w:val="16"/>
+          <w:sz w:val="14"/>
         </w:rPr>
         <w:t xml:space="preserve"> (https://docs.oracle.com/pls/topic/lookup?ctx=en/industries/financial-services/financial-services-cloud/describesday1configurations&amp;id=PLAFS-GUID-66E2AEBD-B816-4D4B-9A17-221530ED590F)</w:t>
       </w:r>
@@ -4779,7 +4815,7 @@
         <w:rPr>
           <w:rFonts w:ascii="Calibri" w:hAnsi="Calibri"/>
           <w:color w:val="2E74B5"/>
-          <w:sz w:val="16"/>
+          <w:sz w:val="14"/>
           <w:u w:val="single"/>
         </w:rPr>
         <w:t>Oracle topic reference: PLAFS-GUID-39275B91-F520-4FB5-85B9-967CD715A90F</w:t>
@@ -4788,7 +4824,7 @@
         <w:rPr>
           <w:rFonts w:ascii="Calibri" w:hAnsi="Calibri"/>
           <w:color w:val="5B6573"/>
-          <w:sz w:val="16"/>
+          <w:sz w:val="14"/>
         </w:rPr>
         <w:t xml:space="preserve"> (https://docs.oracle.com/pls/topic/lookup?ctx=en/industries/financial-services/financial-services-cloud/describesday1configurations&amp;id=PLAFS-GUID-39275B91-F520-4FB5-85B9-967CD715A90F)</w:t>
       </w:r>
@@ -4801,7 +4837,7 @@
         <w:rPr>
           <w:rFonts w:ascii="Calibri" w:hAnsi="Calibri"/>
           <w:color w:val="2E74B5"/>
-          <w:sz w:val="16"/>
+          <w:sz w:val="14"/>
           <w:u w:val="single"/>
         </w:rPr>
         <w:t>Oracle topic reference: PLAFS-GUID-CDCB100A-E957-41ED-915E-5769DF33210F</w:t>
@@ -4810,7 +4846,7 @@
         <w:rPr>
           <w:rFonts w:ascii="Calibri" w:hAnsi="Calibri"/>
           <w:color w:val="5B6573"/>
-          <w:sz w:val="16"/>
+          <w:sz w:val="14"/>
         </w:rPr>
         <w:t xml:space="preserve"> (https://docs.oracle.com/pls/topic/lookup?ctx=en/industries/financial-services/financial-services-cloud/describesday1configurations&amp;id=PLAFS-GUID-CDCB100A-E957-41ED-915E-5769DF33210F)</w:t>
       </w:r>

</xml_diff>